<commit_message>
Manuscript: circuit-level (EMT) results for 12 scenarios x 3 controllers
Co-Authored-By: Claude Opus 5.5 <noreply@anthropic.com>
Claude-Session: https://claude.ai/code/session_01FcrrmkJTVMUBqnhfmaF7Pm
</commit_message>
<xml_diff>
--- a/paper/IREA_manuscript.docx
+++ b/paper/IREA_manuscript.docx
@@ -101,7 +101,7 @@
           <w:sz w:val="20"/>
           <w:szCs w:val="20"/>
         </w:rPr>
-        <w:t xml:space="preserve">X</w:t>
+        <w:t xml:space="preserve">0.014–0.018</w:t>
       </w:r>
       <w:r>
         <w:rPr>
@@ -117,7 +117,7 @@
           <w:sz w:val="20"/>
           <w:szCs w:val="20"/>
         </w:rPr>
-        <w:t xml:space="preserve">X</w:t>
+        <w:t xml:space="preserve">2.5</w:t>
       </w:r>
       <w:r>
         <w:rPr>
@@ -12456,7 +12456,7 @@
           <w:sz w:val="20"/>
           <w:szCs w:val="20"/>
         </w:rPr>
-        <w:t xml:space="preserve">X</w:t>
+        <w:t xml:space="preserve">The results below were obtained with a fixed-step script solver of the same three-phase circuit; the Simscape Electrical model built from the same files is provided for confirmation in MATLAB R2021a.</w:t>
       </w:r>
     </w:p>
     <w:p>
@@ -12478,95 +12478,47 @@
           <w:sz w:val="20"/>
           <w:szCs w:val="20"/>
         </w:rPr>
-        <w:t xml:space="preserve">X</w:t>
-      </w:r>
-      <w:r>
-        <w:rPr>
-          <w:rFonts w:ascii="Times New Roman" w:cs="Times New Roman" w:eastAsia="Times New Roman" w:hAnsi="Times New Roman"/>
-          <w:sz w:val="20"/>
-          <w:szCs w:val="20"/>
-        </w:rPr>
-        <w:t xml:space="preserve"> Hz (Fig. 7, Table VII). The worst-event nadir is </w:t>
-      </w:r>
-      <w:r>
-        <w:rPr>
-          <w:rFonts w:ascii="Times New Roman" w:cs="Times New Roman" w:eastAsia="Times New Roman" w:hAnsi="Times New Roman"/>
-          <w:sz w:val="20"/>
-          <w:szCs w:val="20"/>
-        </w:rPr>
-        <w:t xml:space="preserve">X</w:t>
-      </w:r>
-      <w:r>
-        <w:rPr>
-          <w:rFonts w:ascii="Times New Roman" w:cs="Times New Roman" w:eastAsia="Times New Roman" w:hAnsi="Times New Roman"/>
-          <w:sz w:val="20"/>
-          <w:szCs w:val="20"/>
-        </w:rPr>
-        <w:t xml:space="preserve"> in the EMT model and the BESS energy differs by </w:t>
-      </w:r>
-      <w:r>
-        <w:rPr>
-          <w:rFonts w:ascii="Times New Roman" w:cs="Times New Roman" w:eastAsia="Times New Roman" w:hAnsi="Times New Roman"/>
-          <w:sz w:val="20"/>
-          <w:szCs w:val="20"/>
-        </w:rPr>
-        <w:t xml:space="preserve">X</w:t>
-      </w:r>
-      <w:r>
-        <w:rPr>
-          <w:rFonts w:ascii="Times New Roman" w:cs="Times New Roman" w:eastAsia="Times New Roman" w:hAnsi="Times New Roman"/>
-          <w:sz w:val="20"/>
-          <w:szCs w:val="20"/>
-        </w:rPr>
-        <w:t xml:space="preserve">. The largest RoCoF over 100 ms is about </w:t>
-      </w:r>
-      <w:r>
-        <w:rPr>
-          <w:rFonts w:ascii="Times New Roman" w:cs="Times New Roman" w:eastAsia="Times New Roman" w:hAnsi="Times New Roman"/>
-          <w:sz w:val="20"/>
-          <w:szCs w:val="20"/>
-        </w:rPr>
-        <w:t xml:space="preserve">X</w:t>
-      </w:r>
-      <w:r>
-        <w:rPr>
-          <w:rFonts w:ascii="Times New Roman" w:cs="Times New Roman" w:eastAsia="Times New Roman" w:hAnsi="Times New Roman"/>
-          <w:sz w:val="20"/>
-          <w:szCs w:val="20"/>
-        </w:rPr>
-        <w:t xml:space="preserve"> times higher in the EMT model: at each load step the bus-voltage phase jumps by roughly 3° because the step current flows through the coupling reactances, and the PLL reads this phase jump as a brief frequency spike, which the averaged model cannot represent. Over a 500 ms window, the window commonly used for RoCoF protection, the difference reduces to </w:t>
-      </w:r>
-      <w:r>
-        <w:rPr>
-          <w:rFonts w:ascii="Times New Roman" w:cs="Times New Roman" w:eastAsia="Times New Roman" w:hAnsi="Times New Roman"/>
-          <w:sz w:val="20"/>
-          <w:szCs w:val="20"/>
-        </w:rPr>
-        <w:t xml:space="preserve">X</w:t>
-      </w:r>
-      <w:r>
-        <w:rPr>
-          <w:rFonts w:ascii="Times New Roman" w:cs="Times New Roman" w:eastAsia="Times New Roman" w:hAnsi="Times New Roman"/>
-          <w:sz w:val="20"/>
-          <w:szCs w:val="20"/>
-        </w:rPr>
-        <w:t xml:space="preserve">. The projected controllers keep infeasible commitments at </w:t>
-      </w:r>
-      <w:r>
-        <w:rPr>
-          <w:rFonts w:ascii="Times New Roman" w:cs="Times New Roman" w:eastAsia="Times New Roman" w:hAnsi="Times New Roman"/>
-          <w:sz w:val="20"/>
-          <w:szCs w:val="20"/>
-        </w:rPr>
-        <w:t xml:space="preserve">X</w:t>
-      </w:r>
-      <w:r>
-        <w:rPr>
-          <w:rFonts w:ascii="Times New Roman" w:cs="Times New Roman" w:eastAsia="Times New Roman" w:hAnsi="Times New Roman"/>
-          <w:sz w:val="20"/>
-          <w:szCs w:val="20"/>
-        </w:rPr>
-        <w:t xml:space="preserve"> per episode in the EMT model, and the ranking of the three controllers is unchanged.</w:t>
+        <w:t xml:space="preserve">0.014–0.018</w:t>
+      </w:r>
+      <w:r>
+        <w:rPr>
+          <w:rFonts w:ascii="Times New Roman" w:cs="Times New Roman" w:eastAsia="Times New Roman" w:hAnsi="Times New Roman"/>
+          <w:sz w:val="20"/>
+          <w:szCs w:val="20"/>
+        </w:rPr>
+        <w:t xml:space="preserve"> Hz (Fig. 7, Table VII). The worst-event nadir agrees within 0.2 % for both fixed controllers and is 4 % deeper for the TD3 policy (0.521 against 0.502 Hz), and the BESS energy agrees within 0.8 %. The largest RoCoF over 100 ms is about </w:t>
+      </w:r>
+      <w:r>
+        <w:rPr>
+          <w:rFonts w:ascii="Times New Roman" w:cs="Times New Roman" w:eastAsia="Times New Roman" w:hAnsi="Times New Roman"/>
+          <w:sz w:val="20"/>
+          <w:szCs w:val="20"/>
+        </w:rPr>
+        <w:t xml:space="preserve">2.5</w:t>
+      </w:r>
+      <w:r>
+        <w:rPr>
+          <w:rFonts w:ascii="Times New Roman" w:cs="Times New Roman" w:eastAsia="Times New Roman" w:hAnsi="Times New Roman"/>
+          <w:sz w:val="20"/>
+          <w:szCs w:val="20"/>
+        </w:rPr>
+        <w:t xml:space="preserve"> times higher in the EMT model: at each load step the bus-voltage phase jumps by roughly 3° because the step current flows through the coupling reactances, and the PLL reads this phase jump as a brief frequency spike, which the averaged model cannot represent. Over a 500 ms window, the window commonly used for RoCoF protection, the difference reduces to between +3 % and +11 %; the RoCoF of the diesel rotor itself, a physical quantity without phase-jump content, is 2.4 Hz/s over 100 ms. The projected controllers keep infeasible commitments at </w:t>
+      </w:r>
+      <w:r>
+        <w:rPr>
+          <w:rFonts w:ascii="Times New Roman" w:cs="Times New Roman" w:eastAsia="Times New Roman" w:hAnsi="Times New Roman"/>
+          <w:sz w:val="20"/>
+          <w:szCs w:val="20"/>
+        </w:rPr>
+        <w:t xml:space="preserve">≤ 0.03 s</w:t>
+      </w:r>
+      <w:r>
+        <w:rPr>
+          <w:rFonts w:ascii="Times New Roman" w:cs="Times New Roman" w:eastAsia="Times New Roman" w:hAnsi="Times New Roman"/>
+          <w:sz w:val="20"/>
+          <w:szCs w:val="20"/>
+        </w:rPr>
+        <w:t xml:space="preserve"> per episode in the EMT model. Converter saturation is the one metric that the averaged model clearly underestimates: in the EMT model the power limiter acts on measured power, which includes the electromagnetic transient in the first cycles after each step, and it is active 2.3–2.7 times longer (0.29–0.40 s against 0.11–0.17 s per episode). The ordering of the three controllers is the same in both models for every metric.</w:t>
       </w:r>
     </w:p>
     <w:p>
@@ -13007,7 +12959,7 @@
                 <w:sz w:val="17"/>
                 <w:szCs w:val="17"/>
               </w:rPr>
-              <w:t xml:space="preserve">X Hz</w:t>
+              <w:t xml:space="preserve">0.014–0.018 Hz</w:t>
             </w:r>
           </w:p>
         </w:tc>
@@ -13108,7 +13060,7 @@
                 <w:sz w:val="17"/>
                 <w:szCs w:val="17"/>
               </w:rPr>
-              <w:t xml:space="preserve">X</w:t>
+              <w:t xml:space="preserve">fixed: within 0.2 %; TD3: 4 % deeper</w:t>
             </w:r>
           </w:p>
         </w:tc>
@@ -13209,7 +13161,7 @@
                 <w:sz w:val="17"/>
                 <w:szCs w:val="17"/>
               </w:rPr>
-              <w:t xml:space="preserve">X</w:t>
+              <w:t xml:space="preserve">within 0.8 %</w:t>
             </w:r>
           </w:p>
         </w:tc>
@@ -13310,7 +13262,7 @@
                 <w:sz w:val="17"/>
                 <w:szCs w:val="17"/>
               </w:rPr>
-              <w:t xml:space="preserve">×X / X</w:t>
+              <w:t xml:space="preserve">×2.5 / +3 to +11 %</w:t>
             </w:r>
           </w:p>
         </w:tc>
@@ -13347,6 +13299,107 @@
                 <w:sz w:val="17"/>
                 <w:szCs w:val="17"/>
               </w:rPr>
+              <w:t xml:space="preserve">EMT vs averaged model</w:t>
+            </w:r>
+          </w:p>
+        </w:tc>
+        <w:tc>
+          <w:tcPr>
+            <w:tcW w:type="dxa" w:w="3700"/>
+            <w:tcBorders>
+              <w:top w:val="single" w:color="808080" w:sz="4"/>
+              <w:left w:val="single" w:color="808080" w:sz="4"/>
+              <w:bottom w:val="single" w:color="808080" w:sz="4"/>
+              <w:right w:val="single" w:color="808080" w:sz="4"/>
+            </w:tcBorders>
+            <w:tcMar>
+              <w:top w:type="dxa" w:w="40"/>
+              <w:left w:type="dxa" w:w="80"/>
+              <w:bottom w:type="dxa" w:w="40"/>
+              <w:right w:type="dxa" w:w="80"/>
+            </w:tcMar>
+          </w:tcPr>
+          <w:p>
+            <w:pPr>
+              <w:jc w:val="center"/>
+            </w:pPr>
+            <w:r>
+              <w:rPr>
+                <w:rFonts w:ascii="Times New Roman" w:cs="Times New Roman" w:eastAsia="Times New Roman" w:hAnsi="Times New Roman"/>
+                <w:b w:val="false"/>
+                <w:bCs w:val="false"/>
+                <w:sz w:val="17"/>
+                <w:szCs w:val="17"/>
+              </w:rPr>
+              <w:t xml:space="preserve">Converter saturation time</w:t>
+            </w:r>
+          </w:p>
+        </w:tc>
+        <w:tc>
+          <w:tcPr>
+            <w:tcW w:type="dxa" w:w="2926"/>
+            <w:tcBorders>
+              <w:top w:val="single" w:color="808080" w:sz="4"/>
+              <w:left w:val="single" w:color="808080" w:sz="4"/>
+              <w:bottom w:val="single" w:color="808080" w:sz="4"/>
+              <w:right w:val="single" w:color="808080" w:sz="4"/>
+            </w:tcBorders>
+            <w:tcMar>
+              <w:top w:type="dxa" w:w="40"/>
+              <w:left w:type="dxa" w:w="80"/>
+              <w:bottom w:type="dxa" w:w="40"/>
+              <w:right w:type="dxa" w:w="80"/>
+            </w:tcMar>
+          </w:tcPr>
+          <w:p>
+            <w:pPr>
+              <w:jc w:val="center"/>
+            </w:pPr>
+            <w:r>
+              <w:rPr>
+                <w:rFonts w:ascii="Times New Roman" w:cs="Times New Roman" w:eastAsia="Times New Roman" w:hAnsi="Times New Roman"/>
+                <w:b w:val="false"/>
+                <w:bCs w:val="false"/>
+                <w:sz w:val="17"/>
+                <w:szCs w:val="17"/>
+              </w:rPr>
+              <w:t xml:space="preserve">×2.3–2.7 (same ordering)</w:t>
+            </w:r>
+          </w:p>
+        </w:tc>
+      </w:tr>
+      <w:tr>
+        <w:trPr>
+          <w:tblHeader w:val="false"/>
+        </w:trPr>
+        <w:tc>
+          <w:tcPr>
+            <w:tcW w:type="dxa" w:w="2400"/>
+            <w:tcBorders>
+              <w:top w:val="single" w:color="808080" w:sz="4"/>
+              <w:left w:val="single" w:color="808080" w:sz="4"/>
+              <w:bottom w:val="single" w:color="808080" w:sz="4"/>
+              <w:right w:val="single" w:color="808080" w:sz="4"/>
+            </w:tcBorders>
+            <w:tcMar>
+              <w:top w:type="dxa" w:w="40"/>
+              <w:left w:type="dxa" w:w="80"/>
+              <w:bottom w:type="dxa" w:w="40"/>
+              <w:right w:type="dxa" w:w="80"/>
+            </w:tcMar>
+          </w:tcPr>
+          <w:p>
+            <w:pPr>
+              <w:jc w:val="left"/>
+            </w:pPr>
+            <w:r>
+              <w:rPr>
+                <w:rFonts w:ascii="Times New Roman" w:cs="Times New Roman" w:eastAsia="Times New Roman" w:hAnsi="Times New Roman"/>
+                <w:b w:val="false"/>
+                <w:bCs w:val="false"/>
+                <w:sz w:val="17"/>
+                <w:szCs w:val="17"/>
+              </w:rPr>
               <w:t xml:space="preserve">EMT, projected controllers</w:t>
             </w:r>
           </w:p>
@@ -13411,7 +13464,7 @@
                 <w:sz w:val="17"/>
                 <w:szCs w:val="17"/>
               </w:rPr>
-              <w:t xml:space="preserve">X</w:t>
+              <w:t xml:space="preserve">≤ 0.03 s</w:t>
             </w:r>
           </w:p>
         </w:tc>
@@ -13430,7 +13483,7 @@
       <w:r>
         <w:drawing>
           <wp:inline distT="0" distB="0" distL="0" distR="0">
-            <wp:extent cx="5667375" cy="3448050"/>
+            <wp:extent cx="5667375" cy="2628900"/>
             <wp:effectExtent t="0" r="0" b="0" l="0"/>
             <wp:docPr id="1" name="fig_emt_validation.png" descr="Fig. 7. Averaged (RMS) model and three-phase EMT model for test scenario 1: frequency deviation and VSG power for the three controllers." title="Fig. 7. Averaged (RMS) model and three-p"/>
             <wp:cNvGraphicFramePr>
@@ -13455,7 +13508,7 @@
                   <pic:spPr bwMode="auto">
                     <a:xfrm>
                       <a:off x="0" y="0"/>
-                      <a:ext cx="5667375" cy="3448050"/>
+                      <a:ext cx="5667375" cy="2628900"/>
                     </a:xfrm>
                     <a:prstGeom prst="rect">
                       <a:avLst/>
@@ -13603,7 +13656,7 @@
           <w:sz w:val="20"/>
           <w:szCs w:val="20"/>
         </w:rPr>
-        <w:t xml:space="preserve">The averaged model reproduces the frequency trajectories and the energy metrics closely enough to train and rank controllers, but it underestimates the RoCoF that a PLL-based measurement reports immediately after a step. Studies that set RoCoF limits from averaged models should evaluate RoCoF over windows long enough to exclude phase-jump spikes, or include the phase jump explicitly.</w:t>
+        <w:t xml:space="preserve">The averaged model reproduces the frequency trajectories and the energy metrics closely enough to train and rank controllers, but it underestimates the RoCoF that a PLL-based measurement reports immediately after a step and the time a converter spends at its power limit. Studies that set RoCoF limits from averaged models should evaluate RoCoF over windows long enough to exclude phase-jump spikes, or include the phase jump explicitly.</w:t>
       </w:r>
     </w:p>
     <w:p>
@@ -13672,7 +13725,7 @@
           <w:sz w:val="20"/>
           <w:szCs w:val="20"/>
         </w:rPr>
-        <w:t xml:space="preserve">For a hybrid diesel–PV–wind–BESS microgrid driven by a year of site data, the benefit of adapting the inertia and damping of a grid-forming battery converter was bounded before any training: a per-scenario oracle improved on the best fixed setting by only 2.1 %, because the synchronous coupling and secondary control leave the VSG parameters little to shape. Residual TD3 and DDPG agents did not exceed a validation-tuned setting on the objective; TD3 found a non-dominated point with a lower nadir and higher battery use. A direction-aware, time-separated headroom requirement kept learned schedules feasible, reducing undeliverable commitments from 5.07 s to 0.02 s per episode, and proportional derating proved preferable to clipping, whereas the summed requirement of earlier work was overly conservative for moderate settings. A MATLAB re-implementation and a three-phase EMT model confirmed the averaged-model results, apart from PLL-measured RoCoF spikes caused by phase jumps. Future work will apply the oracle to plants with weaker grid-forming coupling, retrain the agents with proportional derating, use measured load and multi-bus networks, and test the controllers in hardware-in-the-loop experiments.</w:t>
+        <w:t xml:space="preserve">For a hybrid diesel–PV–wind–BESS microgrid driven by a year of site data, the benefit of adapting the inertia and damping of a grid-forming battery converter was bounded before any training: a per-scenario oracle improved on the best fixed setting by only 2.1 %, because the synchronous coupling and secondary control leave the VSG parameters little to shape. Residual TD3 and DDPG agents did not exceed a validation-tuned setting on the objective; TD3 found a non-dominated point with a lower nadir and higher battery use. A direction-aware, time-separated headroom requirement kept learned schedules feasible, reducing undeliverable commitments from 5.07 s to 0.02 s per episode, and proportional derating proved preferable to clipping, whereas the summed requirement of earlier work was overly conservative for moderate settings. A MATLAB re-implementation and a three-phase EMT model confirmed the averaged-model frequency trajectories and the controller ranking, while showing that phase jumps inflate PLL-measured RoCoF and that limiter activity is underestimated by the averaged model. Future work will apply the oracle to plants with weaker grid-forming coupling, retrain the agents with proportional derating, use measured load and multi-bus networks, and test the controllers in hardware-in-the-loop experiments.</w:t>
       </w:r>
     </w:p>
     <w:p>

</xml_diff>

<commit_message>
Thesis proposal (SUT template) and Fig. 1 single-line diagram
- paper/make_proposal.js -> paper/Thesis_Proposal_MB_Khan.docx: five chapters
  following the school template, PRISMA 2020 protocol and flow, literature and
  gap tables, methodology of both studies, preliminary results, schedule
- paper/proposal_figures.py: PRISMA flow, conceptual framework, single-line
- IREA manuscript: Fig. 1 single-line diagram replaces the placeholder

Co-Authored-By: Claude Opus 5.5 <noreply@anthropic.com>
Claude-Session: https://claude.ai/code/session_01FcrrmkJTVMUBqnhfmaF7Pm
</commit_message>
<xml_diff>
--- a/paper/IREA_manuscript.docx
+++ b/paper/IREA_manuscript.docx
@@ -1150,22 +1150,55 @@
     </w:p>
     <w:p>
       <w:pPr>
-        <w:spacing w:after="160" w:before="120"/>
+        <w:spacing w:before="120"/>
         <w:jc w:val="center"/>
       </w:pPr>
       <w:r>
-        <w:rPr>
-          <w:rFonts w:ascii="Times New Roman" w:cs="Times New Roman" w:eastAsia="Times New Roman" w:hAnsi="Times New Roman"/>
-          <w:b w:val="false"/>
-          <w:bCs w:val="false"/>
-          <w:i w:val="false"/>
-          <w:iCs w:val="false"/>
-          <w:sz w:val="20"/>
-          <w:szCs w:val="20"/>
-          <w:shd w:fill="FFFF00" w:color="auto" w:val="clear"/>
-        </w:rPr>
-        <w:t xml:space="preserve">[AUTHOR: insert Fig. 1 — single-line diagram: diesel SG, wind (grid-following), de-loaded PV and BESS behind the VSG converter, load bus, EMS and the scheduler of (J, D, α)]</w:t>
-      </w:r>
+        <w:drawing>
+          <wp:inline distT="0" distB="0" distL="0" distR="0">
+            <wp:extent cx="5124450" cy="2905125"/>
+            <wp:effectExtent t="0" r="0" b="0" l="0"/>
+            <wp:docPr id="1" name="../../paper/proposal_figs/fig_single_line.png" descr="Fig. 1. Hybrid microgrid and control structure." title="Fig. 1. Hybrid microgrid and control str"/>
+            <wp:cNvGraphicFramePr>
+              <a:graphicFrameLocks xmlns:a="http://schemas.openxmlformats.org/drawingml/2006/main" noChangeAspect="1"/>
+            </wp:cNvGraphicFramePr>
+            <a:graphic xmlns:a="http://schemas.openxmlformats.org/drawingml/2006/main">
+              <a:graphicData uri="http://schemas.openxmlformats.org/drawingml/2006/picture">
+                <pic:pic xmlns:pic="http://schemas.openxmlformats.org/drawingml/2006/picture">
+                  <pic:nvPicPr>
+                    <pic:cNvPr id="0" name="" descr=""/>
+                    <pic:cNvPicPr>
+                      <a:picLocks noChangeAspect="1" noChangeArrowheads="1"/>
+                    </pic:cNvPicPr>
+                  </pic:nvPicPr>
+                  <pic:blipFill>
+                    <a:blip r:embed="rId8" cstate="none"/>
+                    <a:srcRect/>
+                    <a:stretch>
+                      <a:fillRect/>
+                    </a:stretch>
+                  </pic:blipFill>
+                  <pic:spPr bwMode="auto">
+                    <a:xfrm>
+                      <a:off x="0" y="0"/>
+                      <a:ext cx="5124450" cy="2905125"/>
+                    </a:xfrm>
+                    <a:prstGeom prst="rect">
+                      <a:avLst/>
+                    </a:prstGeom>
+                  </pic:spPr>
+                </pic:pic>
+              </a:graphicData>
+            </a:graphic>
+          </wp:inline>
+        </w:drawing>
+      </w:r>
+    </w:p>
+    <w:p>
+      <w:pPr>
+        <w:spacing w:after="160"/>
+        <w:jc w:val="center"/>
+      </w:pPr>
       <w:r>
         <w:rPr>
           <w:rFonts w:ascii="Times New Roman" w:cs="Times New Roman" w:eastAsia="Times New Roman" w:hAnsi="Times New Roman"/>
@@ -1176,7 +1209,7 @@
           <w:sz w:val="18"/>
           <w:szCs w:val="18"/>
         </w:rPr>
-        <w:t xml:space="preserve">  Fig. 1. Hybrid microgrid and control structure.</w:t>
+        <w:t xml:space="preserve">Fig. 1. Hybrid microgrid and control structure.</w:t>
       </w:r>
     </w:p>
     <w:p>
@@ -3916,7 +3949,7 @@
                     </pic:cNvPicPr>
                   </pic:nvPicPr>
                   <pic:blipFill>
-                    <a:blip r:embed="rId8" cstate="none"/>
+                    <a:blip r:embed="rId9" cstate="none"/>
                     <a:srcRect/>
                     <a:stretch>
                       <a:fillRect/>
@@ -8340,7 +8373,7 @@
                     </pic:cNvPicPr>
                   </pic:nvPicPr>
                   <pic:blipFill>
-                    <a:blip r:embed="rId9" cstate="none"/>
+                    <a:blip r:embed="rId10" cstate="none"/>
                     <a:srcRect/>
                     <a:stretch>
                       <a:fillRect/>
@@ -11089,7 +11122,7 @@
                     </pic:cNvPicPr>
                   </pic:nvPicPr>
                   <pic:blipFill>
-                    <a:blip r:embed="rId10" cstate="none"/>
+                    <a:blip r:embed="rId11" cstate="none"/>
                     <a:srcRect/>
                     <a:stretch>
                       <a:fillRect/>
@@ -12256,7 +12289,7 @@
                     </pic:cNvPicPr>
                   </pic:nvPicPr>
                   <pic:blipFill>
-                    <a:blip r:embed="rId11" cstate="none"/>
+                    <a:blip r:embed="rId12" cstate="none"/>
                     <a:srcRect/>
                     <a:stretch>
                       <a:fillRect/>
@@ -12320,7 +12353,7 @@
                     </pic:cNvPicPr>
                   </pic:nvPicPr>
                   <pic:blipFill>
-                    <a:blip r:embed="rId12" cstate="none"/>
+                    <a:blip r:embed="rId13" cstate="none"/>
                     <a:srcRect/>
                     <a:stretch>
                       <a:fillRect/>
@@ -13499,7 +13532,7 @@
                     </pic:cNvPicPr>
                   </pic:nvPicPr>
                   <pic:blipFill>
-                    <a:blip r:embed="rId13" cstate="none"/>
+                    <a:blip r:embed="rId14" cstate="none"/>
                     <a:srcRect/>
                     <a:stretch>
                       <a:fillRect/>

</xml_diff>